<commit_message>
Update contractor brief: relay GPIOs in ascending order, F1/F2 fuses to 500mA
</commit_message>
<xml_diff>
--- a/schematics/Hobby_Board_Contractor_Brief_Rev2.docx
+++ b/schematics/Hobby_Board_Contractor_Brief_Rev2.docx
@@ -457,7 +457,7 @@
           <w:b w:val="0"/>
           <w:i w:val="0"/>
         </w:rPr>
-        <w:t>Three 1 A resettable PTC polyfuses are used. Each fuse protects a separate path; a fault in one path does not blow the others.</w:t>
+        <w:t>Three resettable PTC polyfuses protect separate current paths; a fault in one path does not affect the others.</w:t>
       </w:r>
     </w:p>
     <w:p>
@@ -465,7 +465,7 @@
         <w:pStyle w:val="ListBullet"/>
       </w:pPr>
       <w:r>
-        <w:t>F1 — 1 A PTC on 24 VAC L1, before the bridge rectifier. Protects the electronics (relay coils, power supply ICs).</w:t>
+        <w:t>F1 — 500 mA PTC on 24 VAC L1, before the bridge rectifier. Protects the electronics (power supply ICs, relay coils).</w:t>
       </w:r>
     </w:p>
     <w:p>
@@ -473,7 +473,7 @@
         <w:pStyle w:val="ListBullet"/>
       </w:pPr>
       <w:r>
-        <w:t>F2 — 1 A PTC on 24 VAC L2 return, before the bridge rectifier. Both AC legs are independently fused for symmetrical protection.</w:t>
+        <w:t>F2 — 500 mA PTC on 24 VAC L2 return, before the bridge rectifier. Both AC legs are independently fused at 500 mA for symmetrical circuit protection.</w:t>
       </w:r>
     </w:p>
     <w:p>
@@ -698,7 +698,7 @@
           </w:tcPr>
           <w:p>
             <w:r>
-              <w:t>GPIO32</w:t>
+              <w:t>GPIO12</w:t>
             </w:r>
           </w:p>
         </w:tc>
@@ -728,7 +728,7 @@
           </w:tcPr>
           <w:p>
             <w:r>
-              <w:t>→ ULN2803A input 1</w:t>
+              <w:t>→ ULN2803A input 1.  Also: 10 kΩ pull-down to GND — see note above.</w:t>
             </w:r>
           </w:p>
         </w:tc>
@@ -740,7 +740,7 @@
           </w:tcPr>
           <w:p>
             <w:r>
-              <w:t>GPIO33</w:t>
+              <w:t>GPIO13</w:t>
             </w:r>
           </w:p>
         </w:tc>
@@ -782,7 +782,7 @@
           </w:tcPr>
           <w:p>
             <w:r>
-              <w:t>GPIO25</w:t>
+              <w:t>GPIO14</w:t>
             </w:r>
           </w:p>
         </w:tc>
@@ -824,7 +824,7 @@
           </w:tcPr>
           <w:p>
             <w:r>
-              <w:t>GPIO26</w:t>
+              <w:t>GPIO25</w:t>
             </w:r>
           </w:p>
         </w:tc>
@@ -866,7 +866,7 @@
           </w:tcPr>
           <w:p>
             <w:r>
-              <w:t>GPIO27</w:t>
+              <w:t>GPIO26</w:t>
             </w:r>
           </w:p>
         </w:tc>
@@ -908,7 +908,7 @@
           </w:tcPr>
           <w:p>
             <w:r>
-              <w:t>GPIO14</w:t>
+              <w:t>GPIO27</w:t>
             </w:r>
           </w:p>
         </w:tc>
@@ -950,7 +950,7 @@
           </w:tcPr>
           <w:p>
             <w:r>
-              <w:t>GPIO12</w:t>
+              <w:t>GPIO32</w:t>
             </w:r>
           </w:p>
         </w:tc>
@@ -980,7 +980,7 @@
           </w:tcPr>
           <w:p>
             <w:r>
-              <w:t>→ ULN2803A input 7.  Also: 10 kΩ pull-down to GND — see note above.</w:t>
+              <w:t>→ ULN2803A input 7</w:t>
             </w:r>
           </w:p>
         </w:tc>
@@ -992,7 +992,7 @@
           </w:tcPr>
           <w:p>
             <w:r>
-              <w:t>GPIO13</w:t>
+              <w:t>GPIO33</w:t>
             </w:r>
           </w:p>
         </w:tc>
@@ -1546,7 +1546,7 @@
         <w:pStyle w:val="ListBullet"/>
       </w:pPr>
       <w:r>
-        <w:t>Inputs 1–8 (pins 1–8): Connected directly to ESP32 GPIO32, 33, 25, 26, 27, 14, 12, 13 respectively.</w:t>
+        <w:t>Inputs 1–8 (pins 1–8): Connected directly to ESP32 GPIO12, 13, 14, 25, 26, 27, 32, 33 respectively (relay channels 1–8 in ascending GPIO order).</w:t>
       </w:r>
     </w:p>
     <w:p>
@@ -3057,6 +3057,68 @@
           </w:tcPr>
           <w:p>
             <w:r>
+              <w:t>500 mA PTC Polyfuse</w:t>
+            </w:r>
+          </w:p>
+        </w:tc>
+        <w:tc>
+          <w:tcPr>
+            <w:tcW w:type="dxa" w:w="1984"/>
+          </w:tcPr>
+          <w:p>
+            <w:r>
+              <w:t>Verify LCSC</w:t>
+            </w:r>
+          </w:p>
+        </w:tc>
+        <w:tc>
+          <w:tcPr>
+            <w:tcW w:type="dxa" w:w="1134"/>
+          </w:tcPr>
+          <w:p>
+            <w:r>
+              <w:t>THT or SMD</w:t>
+            </w:r>
+          </w:p>
+        </w:tc>
+        <w:tc>
+          <w:tcPr>
+            <w:tcW w:type="dxa" w:w="454"/>
+          </w:tcPr>
+          <w:p>
+            <w:r>
+              <w:t>2</w:t>
+            </w:r>
+          </w:p>
+        </w:tc>
+        <w:tc>
+          <w:tcPr>
+            <w:tcW w:type="dxa" w:w="1020"/>
+          </w:tcPr>
+          <w:p>
+            <w:r>
+              <w:t>Reflow/Hand</w:t>
+            </w:r>
+          </w:p>
+        </w:tc>
+        <w:tc>
+          <w:tcPr>
+            <w:tcW w:type="dxa" w:w="2494"/>
+          </w:tcPr>
+          <w:p>
+            <w:r>
+              <w:t>F1 (L1 circuit power) and F2 (L2 circuit power). Both 500 mA.</w:t>
+            </w:r>
+          </w:p>
+        </w:tc>
+      </w:tr>
+      <w:tr>
+        <w:tc>
+          <w:tcPr>
+            <w:tcW w:type="dxa" w:w="3118"/>
+          </w:tcPr>
+          <w:p>
+            <w:r>
               <w:t>1 A PTC Polyfuse</w:t>
             </w:r>
           </w:p>
@@ -3087,7 +3149,7 @@
           </w:tcPr>
           <w:p>
             <w:r>
-              <w:t>3</w:t>
+              <w:t>1</w:t>
             </w:r>
           </w:p>
         </w:tc>
@@ -3107,7 +3169,7 @@
           </w:tcPr>
           <w:p>
             <w:r>
-              <w:t>F1 (L1 circuit), F2 (L2 circuit), F3 (zone contact commons). Three independent fuses.</w:t>
+              <w:t>F3 (relay contact commons bus — zone output side). 1 A rated.</w:t>
             </w:r>
           </w:p>
         </w:tc>

</xml_diff>

<commit_message>
Move relay Ch1 from GPIO12 to GPIO4; GPIO12 dedicated strapping pull-down only
</commit_message>
<xml_diff>
--- a/schematics/Hobby_Board_Contractor_Brief_Rev2.docx
+++ b/schematics/Hobby_Board_Contractor_Brief_Rev2.docx
@@ -602,7 +602,7 @@
         <w:pStyle w:val="ListBullet"/>
       </w:pPr>
       <w:r>
-        <w:t>GPIO12 strapping pin — CRITICAL: Connect a 10 kΩ resistor from GPIO12 to GND. This pin controls SDIO voltage selection at boot. If it reads HIGH, the module selects 1.8 V flash voltage and will not start. The pull-down resistor is mandatory.</w:t>
+        <w:t>GPIO12 strapping pin — CRITICAL: GPIO12 is NOT used as a relay output. Connect a 10 kΩ resistor from GPIO12 to GND and leave the pin otherwise unconnected. This pin controls SDIO voltage selection at boot — if it reads HIGH the module selects 1.8 V flash voltage and will not start. The pull-down resistor is mandatory. Do not connect GPIO12 to the ULN2803A or any other driven signal.</w:t>
       </w:r>
     </w:p>
     <w:p>
@@ -698,7 +698,7 @@
           </w:tcPr>
           <w:p>
             <w:r>
-              <w:t>GPIO12</w:t>
+              <w:t>GPIO4</w:t>
             </w:r>
           </w:p>
         </w:tc>
@@ -728,7 +728,7 @@
           </w:tcPr>
           <w:p>
             <w:r>
-              <w:t>→ ULN2803A input 1.  Also: 10 kΩ pull-down to GND — see note above.</w:t>
+              <w:t>→ ULN2803A input 1</w:t>
             </w:r>
           </w:p>
         </w:tc>
@@ -1023,6 +1023,48 @@
           <w:p>
             <w:r>
               <w:t>→ ULN2803A input 8</w:t>
+            </w:r>
+          </w:p>
+        </w:tc>
+      </w:tr>
+      <w:tr>
+        <w:tc>
+          <w:tcPr>
+            <w:tcW w:type="dxa" w:w="1587"/>
+          </w:tcPr>
+          <w:p>
+            <w:r>
+              <w:t>GPIO12</w:t>
+            </w:r>
+          </w:p>
+        </w:tc>
+        <w:tc>
+          <w:tcPr>
+            <w:tcW w:type="dxa" w:w="2268"/>
+          </w:tcPr>
+          <w:p>
+            <w:r>
+              <w:t>Strapping pin — NOT a relay output</w:t>
+            </w:r>
+          </w:p>
+        </w:tc>
+        <w:tc>
+          <w:tcPr>
+            <w:tcW w:type="dxa" w:w="1134"/>
+          </w:tcPr>
+          <w:p>
+            <w:r>
+              <w:t>N/A</w:t>
+            </w:r>
+          </w:p>
+        </w:tc>
+        <w:tc>
+          <w:tcPr>
+            <w:tcW w:type="dxa" w:w="3798"/>
+          </w:tcPr>
+          <w:p>
+            <w:r>
+              <w:t>10 kΩ pull-down to GND only. Do not connect to ULN2803A or any driven net. See Section 2.2 note.</w:t>
             </w:r>
           </w:p>
         </w:tc>
@@ -1546,7 +1588,7 @@
         <w:pStyle w:val="ListBullet"/>
       </w:pPr>
       <w:r>
-        <w:t>Inputs 1–8 (pins 1–8): Connected directly to ESP32 GPIO12, 13, 14, 25, 26, 27, 32, 33 respectively (relay channels 1–8 in ascending GPIO order).</w:t>
+        <w:t>Inputs 1–8 (pins 1–8): Connected directly to ESP32 GPIO4, 13, 14, 25, 26, 27, 32, 33 respectively (relay channels 1–8). GPIO12 is NOT connected here — it is a dedicated strapping resistor only (see Section 2.2).</w:t>
       </w:r>
     </w:p>
     <w:p>

</xml_diff>

<commit_message>
Commit MCP23008 for DIP switch, assign all GPIOs, add Section 2.6 expander
</commit_message>
<xml_diff>
--- a/schematics/Hobby_Board_Contractor_Brief_Rev2.docx
+++ b/schematics/Hobby_Board_Contractor_Brief_Rev2.docx
@@ -1286,7 +1286,7 @@
           </w:tcPr>
           <w:p>
             <w:r>
-              <w:t>TBD × 8</w:t>
+              <w:t>GPIO16</w:t>
             </w:r>
           </w:p>
         </w:tc>
@@ -1296,7 +1296,7 @@
           </w:tcPr>
           <w:p>
             <w:r>
-              <w:t>DIP switch inputs (Zone 1–8)</w:t>
+              <w:t>Rotary switch BCD bit 0 (Time)</w:t>
             </w:r>
           </w:p>
         </w:tc>
@@ -1316,7 +1316,7 @@
           </w:tcPr>
           <w:p>
             <w:r>
-              <w:t>Active LOW (10 kΩ pull-up each). Use GPIO expander (MCP23008 or PCF8574) if GPIO count is insufficient.</w:t>
+              <w:t>← SW_ROT BCD output A. 10 kΩ pull-up to 3.3 V. Active LOW.</w:t>
             </w:r>
           </w:p>
         </w:tc>
@@ -1328,7 +1328,7 @@
           </w:tcPr>
           <w:p>
             <w:r>
-              <w:t>TBD × 2</w:t>
+              <w:t>GPIO17</w:t>
             </w:r>
           </w:p>
         </w:tc>
@@ -1338,7 +1338,7 @@
           </w:tcPr>
           <w:p>
             <w:r>
-              <w:t>Rotary switch BCD (Time)</w:t>
+              <w:t>Rotary switch BCD bit 1 (Time)</w:t>
             </w:r>
           </w:p>
         </w:tc>
@@ -1358,7 +1358,7 @@
           </w:tcPr>
           <w:p>
             <w:r>
-              <w:t>2-bit BCD output from SW_ROT. Confirm logic levels with selected rotary part.</w:t>
+              <w:t>← SW_ROT BCD output B. 10 kΩ pull-up to 3.3 V. Active LOW.</w:t>
             </w:r>
           </w:p>
         </w:tc>
@@ -1370,7 +1370,7 @@
           </w:tcPr>
           <w:p>
             <w:r>
-              <w:t>TBD</w:t>
+              <w:t>GPIO18</w:t>
             </w:r>
           </w:p>
         </w:tc>
@@ -1400,7 +1400,7 @@
           </w:tcPr>
           <w:p>
             <w:r>
-              <w:t>Active LOW, 10 kΩ pull-up to 3.3 V.</w:t>
+              <w:t>← SW_START contact. Active LOW, 10 kΩ pull-up to 3.3 V.</w:t>
             </w:r>
           </w:p>
         </w:tc>
@@ -1412,7 +1412,7 @@
           </w:tcPr>
           <w:p>
             <w:r>
-              <w:t>TBD</w:t>
+              <w:t>GPIO19</w:t>
             </w:r>
           </w:p>
         </w:tc>
@@ -1442,7 +1442,133 @@
           </w:tcPr>
           <w:p>
             <w:r>
-              <w:t>Active HIGH → 330 Ω → button LED anode.</w:t>
+              <w:t>→ 330 Ω → SW_START LED anode. Active HIGH.</w:t>
+            </w:r>
+          </w:p>
+        </w:tc>
+      </w:tr>
+      <w:tr>
+        <w:tc>
+          <w:tcPr>
+            <w:tcW w:type="dxa" w:w="1587"/>
+          </w:tcPr>
+          <w:p>
+            <w:r>
+              <w:t>GPIO21</w:t>
+            </w:r>
+          </w:p>
+        </w:tc>
+        <w:tc>
+          <w:tcPr>
+            <w:tcW w:type="dxa" w:w="2268"/>
+          </w:tcPr>
+          <w:p>
+            <w:r>
+              <w:t>I²C SDA — MCP23008</w:t>
+            </w:r>
+          </w:p>
+        </w:tc>
+        <w:tc>
+          <w:tcPr>
+            <w:tcW w:type="dxa" w:w="1134"/>
+          </w:tcPr>
+          <w:p>
+            <w:r>
+              <w:t>I/O</w:t>
+            </w:r>
+          </w:p>
+        </w:tc>
+        <w:tc>
+          <w:tcPr>
+            <w:tcW w:type="dxa" w:w="3798"/>
+          </w:tcPr>
+          <w:p>
+            <w:r>
+              <w:t>SDA to MCP23008 pin 2. 4.7 kΩ pull-up to 3.3 V.</w:t>
+            </w:r>
+          </w:p>
+        </w:tc>
+      </w:tr>
+      <w:tr>
+        <w:tc>
+          <w:tcPr>
+            <w:tcW w:type="dxa" w:w="1587"/>
+          </w:tcPr>
+          <w:p>
+            <w:r>
+              <w:t>GPIO22</w:t>
+            </w:r>
+          </w:p>
+        </w:tc>
+        <w:tc>
+          <w:tcPr>
+            <w:tcW w:type="dxa" w:w="2268"/>
+          </w:tcPr>
+          <w:p>
+            <w:r>
+              <w:t>I²C SCL — MCP23008</w:t>
+            </w:r>
+          </w:p>
+        </w:tc>
+        <w:tc>
+          <w:tcPr>
+            <w:tcW w:type="dxa" w:w="1134"/>
+          </w:tcPr>
+          <w:p>
+            <w:r>
+              <w:t>Output</w:t>
+            </w:r>
+          </w:p>
+        </w:tc>
+        <w:tc>
+          <w:tcPr>
+            <w:tcW w:type="dxa" w:w="3798"/>
+          </w:tcPr>
+          <w:p>
+            <w:r>
+              <w:t>SCL to MCP23008 pin 1. 4.7 kΩ pull-up to 3.3 V.</w:t>
+            </w:r>
+          </w:p>
+        </w:tc>
+      </w:tr>
+      <w:tr>
+        <w:tc>
+          <w:tcPr>
+            <w:tcW w:type="dxa" w:w="1587"/>
+          </w:tcPr>
+          <w:p>
+            <w:r>
+              <w:t>(MCP23008)</w:t>
+            </w:r>
+          </w:p>
+        </w:tc>
+        <w:tc>
+          <w:tcPr>
+            <w:tcW w:type="dxa" w:w="2268"/>
+          </w:tcPr>
+          <w:p>
+            <w:r>
+              <w:t>DIP switch inputs Zone 1–8</w:t>
+            </w:r>
+          </w:p>
+        </w:tc>
+        <w:tc>
+          <w:tcPr>
+            <w:tcW w:type="dxa" w:w="1134"/>
+          </w:tcPr>
+          <w:p>
+            <w:r>
+              <w:t>Input</w:t>
+            </w:r>
+          </w:p>
+        </w:tc>
+        <w:tc>
+          <w:tcPr>
+            <w:tcW w:type="dxa" w:w="3798"/>
+          </w:tcPr>
+          <w:p>
+            <w:r>
+              <w:t>All 8 DIP switch inputs routed to MCP23008 GP0–GP7 (not direct ESP32 GPIOs). See Section 2.6.</w:t>
             </w:r>
           </w:p>
         </w:tc>
@@ -1457,7 +1583,7 @@
           <w:i/>
           <w:color w:val="804000"/>
         </w:rPr>
-        <w:t>⚠  Confirm TBD GPIO assignments with board owner before starting layout. If a GPIO expander is used for the DIP switch, confirm I²C address and pull-up requirements (SDA/SCL pulled to 3.3 V via 4.7 kΩ each).</w:t>
+        <w:t>All GPIO assignments are final. DIP switch inputs are routed through the MCP23008 I²C GPIO expander — do NOT connect DIP switch lines directly to the ESP32. SDA and SCL require 4.7 kΩ pull-ups to 3.3 V.</w:t>
       </w:r>
     </w:p>
     <w:p>
@@ -1748,7 +1874,7 @@
         <w:pStyle w:val="ListBullet"/>
       </w:pPr>
       <w:r>
-        <w:t>Each switch input: pulled high to 3.3 V through a 10 kΩ resistor (R18–R25). Switch closes to GND when activated. Active LOW logic.</w:t>
+        <w:t>Switch outputs connect to MCP23008 GP0–GP7 (not directly to ESP32 GPIOs). The MCP23008 internal pull-ups are enabled in firmware — no external pull-up resistors required on the switch lines. Switch closes to GND when activated. Active LOW.</w:t>
       </w:r>
     </w:p>
     <w:p>
@@ -1756,7 +1882,7 @@
         <w:pStyle w:val="ListBullet"/>
       </w:pPr>
       <w:r>
-        <w:t>Connect switch outputs to ESP32 GPIOs or, if GPIO count is insufficient, to an I²C GPIO expander (MCP23008 or PCF8574) — confirm with board owner before routing.</w:t>
+        <w:t>See Section 2.6 for MCP23008 wiring and addressing.</w:t>
       </w:r>
     </w:p>
     <w:p>
@@ -1860,7 +1986,136 @@
         <w:pStyle w:val="Heading2"/>
       </w:pPr>
       <w:r>
-        <w:t>2.6  Indicator LEDs</w:t>
+        <w:t>2.6  I²C GPIO Expander — MCP23008</w:t>
+      </w:r>
+    </w:p>
+    <w:p>
+      <w:r>
+        <w:rPr>
+          <w:b w:val="0"/>
+          <w:i w:val="0"/>
+        </w:rPr>
+        <w:t>The MCP23008 is an 8-channel I²C GPIO expander used to read all 8 DIP switch inputs over a 2-wire I²C bus, freeing ESP32 GPIOs for other functions.</w:t>
+      </w:r>
+    </w:p>
+    <w:p>
+      <w:pPr>
+        <w:pStyle w:val="Heading3"/>
+      </w:pPr>
+      <w:r>
+        <w:t>Connections</w:t>
+      </w:r>
+    </w:p>
+    <w:p>
+      <w:pPr>
+        <w:pStyle w:val="ListBullet"/>
+      </w:pPr>
+      <w:r>
+        <w:t>VDD: 3.3 V. GND: GND.</w:t>
+      </w:r>
+    </w:p>
+    <w:p>
+      <w:pPr>
+        <w:pStyle w:val="ListBullet"/>
+      </w:pPr>
+      <w:r>
+        <w:t>SDA (pin 2): Connected to ESP32 GPIO21. 4.7 kΩ pull-up resistor to 3.3 V on this line.</w:t>
+      </w:r>
+    </w:p>
+    <w:p>
+      <w:pPr>
+        <w:pStyle w:val="ListBullet"/>
+      </w:pPr>
+      <w:r>
+        <w:t>SCL (pin 1): Connected to ESP32 GPIO22. 4.7 kΩ pull-up resistor to 3.3 V on this line.</w:t>
+      </w:r>
+    </w:p>
+    <w:p>
+      <w:pPr>
+        <w:pStyle w:val="ListBullet"/>
+      </w:pPr>
+      <w:r>
+        <w:t>RESET (pin 6): Connect to 3.3 V. Active LOW — tie HIGH for normal operation.</w:t>
+      </w:r>
+    </w:p>
+    <w:p>
+      <w:pPr>
+        <w:pStyle w:val="ListBullet"/>
+      </w:pPr>
+      <w:r>
+        <w:t>Address pins A0, A1, A2 (pins 5, 4, 3): All connected to GND. This sets the I²C address to 0x20.</w:t>
+      </w:r>
+    </w:p>
+    <w:p>
+      <w:pPr>
+        <w:pStyle w:val="ListBullet"/>
+      </w:pPr>
+      <w:r>
+        <w:t>GP0–GP7 (pins 10–17): Connected to DIP switch positions 1–8 respectively. Other side of each switch connects to GND. MCP23008 internal pull-ups are enabled via the GPPU register (0x06 = 0xFF) in firmware — no external pull-up resistors needed on GP0–GP7.</w:t>
+      </w:r>
+    </w:p>
+    <w:p>
+      <w:pPr>
+        <w:pStyle w:val="Heading3"/>
+      </w:pPr>
+      <w:r>
+        <w:t>Firmware Operation</w:t>
+      </w:r>
+    </w:p>
+    <w:p>
+      <w:pPr>
+        <w:pStyle w:val="ListBullet"/>
+      </w:pPr>
+      <w:r>
+        <w:t>Configure all 8 pins as inputs: write 0xFF to IODIR register (0x00).</w:t>
+      </w:r>
+    </w:p>
+    <w:p>
+      <w:pPr>
+        <w:pStyle w:val="ListBullet"/>
+      </w:pPr>
+      <w:r>
+        <w:t>Enable internal pull-ups: write 0xFF to GPPU register (0x06).</w:t>
+      </w:r>
+    </w:p>
+    <w:p>
+      <w:pPr>
+        <w:pStyle w:val="ListBullet"/>
+      </w:pPr>
+      <w:r>
+        <w:t>Read all 8 switch states in one I²C transaction: read GPIO register (0x09). Returns a single byte — bit 0 = Zone 1, bit 1 = Zone 2, …, bit 7 = Zone 8. A bit reading 0 means that switch is ON (closed to GND).</w:t>
+      </w:r>
+    </w:p>
+    <w:p>
+      <w:pPr>
+        <w:pStyle w:val="ListBullet"/>
+      </w:pPr>
+      <w:r>
+        <w:t>Suggested read interval: poll every 200 ms. DIP switch state is not time-critical.</w:t>
+      </w:r>
+    </w:p>
+    <w:p>
+      <w:pPr>
+        <w:pStyle w:val="Heading3"/>
+      </w:pPr>
+      <w:r>
+        <w:t>Package</w:t>
+      </w:r>
+    </w:p>
+    <w:p>
+      <w:pPr>
+        <w:pStyle w:val="ListBullet"/>
+      </w:pPr>
+      <w:r>
+        <w:t>Use SOIC-18 (surface-mount) for JLCPCB PCBA compatibility. Search LCSC for "MCP23008" — verify the SOIC-18 package before ordering. DIP-18 is through-hole only and requires hand assembly.</w:t>
+      </w:r>
+    </w:p>
+    <w:p>
+      <w:pPr>
+        <w:pStyle w:val="Heading2"/>
+      </w:pPr>
+      <w:r>
+        <w:t>2.7  Indicator LEDs</w:t>
       </w:r>
     </w:p>
     <w:p>
@@ -1884,7 +2139,7 @@
         <w:pStyle w:val="Heading2"/>
       </w:pPr>
       <w:r>
-        <w:t>2.7  Output Protection — MOV Snubbers</w:t>
+        <w:t>2.8  Output Protection — MOV Snubbers</w:t>
       </w:r>
     </w:p>
     <w:p>
@@ -2603,7 +2858,7 @@
           </w:tcPr>
           <w:p>
             <w:r>
-              <w:t>MCP23008 I²C GPIO Expander (optional)</w:t>
+              <w:t>MCP23008 I²C GPIO Expander</w:t>
             </w:r>
           </w:p>
         </w:tc>
@@ -2613,7 +2868,7 @@
           </w:tcPr>
           <w:p>
             <w:r>
-              <w:t>Verify LCSC</w:t>
+              <w:t>Verify LCSC — search "MCP23008"</w:t>
             </w:r>
           </w:p>
         </w:tc>
@@ -2623,7 +2878,7 @@
           </w:tcPr>
           <w:p>
             <w:r>
-              <w:t>SOIC-18 / DIP-18</w:t>
+              <w:t>SOIC-18</w:t>
             </w:r>
           </w:p>
         </w:tc>
@@ -2653,7 +2908,7 @@
           </w:tcPr>
           <w:p>
             <w:r>
-              <w:t>Only if available GPIOs are insufficient for DIP switch. Confirm with board owner.</w:t>
+              <w:t>Reads all 8 DIP switch inputs over I²C. Address 0x20 (A0/A1/A2 to GND). Use SOIC-18 for SMD assembly.</w:t>
             </w:r>
           </w:p>
         </w:tc>
@@ -3625,7 +3880,7 @@
           </w:tcPr>
           <w:p>
             <w:r>
-              <w:t>18</w:t>
+              <w:t>8</w:t>
             </w:r>
           </w:p>
         </w:tc>
@@ -3645,7 +3900,69 @@
           </w:tcPr>
           <w:p>
             <w:r>
-              <w:t>Pull-ups (EN, IO0), GPIO12 pull-down, Q1/Q2 bases, DIP switch pull-ups (R3–R7, R18–R25)</w:t>
+              <w:t>Pull-ups: EN, IO0, rotary BCD A/B, start button input (×5); GPIO12 pull-down (×1); Q1/Q2 base resistors (×2)</w:t>
+            </w:r>
+          </w:p>
+        </w:tc>
+      </w:tr>
+      <w:tr>
+        <w:tc>
+          <w:tcPr>
+            <w:tcW w:type="dxa" w:w="3118"/>
+          </w:tcPr>
+          <w:p>
+            <w:r>
+              <w:t>4.7 kΩ Resistor 0402</w:t>
+            </w:r>
+          </w:p>
+        </w:tc>
+        <w:tc>
+          <w:tcPr>
+            <w:tcW w:type="dxa" w:w="1984"/>
+          </w:tcPr>
+          <w:p>
+            <w:r>
+              <w:t>Basic</w:t>
+            </w:r>
+          </w:p>
+        </w:tc>
+        <w:tc>
+          <w:tcPr>
+            <w:tcW w:type="dxa" w:w="1134"/>
+          </w:tcPr>
+          <w:p>
+            <w:r>
+              <w:t>0402</w:t>
+            </w:r>
+          </w:p>
+        </w:tc>
+        <w:tc>
+          <w:tcPr>
+            <w:tcW w:type="dxa" w:w="454"/>
+          </w:tcPr>
+          <w:p>
+            <w:r>
+              <w:t>2</w:t>
+            </w:r>
+          </w:p>
+        </w:tc>
+        <w:tc>
+          <w:tcPr>
+            <w:tcW w:type="dxa" w:w="1020"/>
+          </w:tcPr>
+          <w:p>
+            <w:r>
+              <w:t>SMD/Reflow</w:t>
+            </w:r>
+          </w:p>
+        </w:tc>
+        <w:tc>
+          <w:tcPr>
+            <w:tcW w:type="dxa" w:w="2494"/>
+          </w:tcPr>
+          <w:p>
+            <w:r>
+              <w:t>I²C bus pull-ups: SDA (GPIO21) and SCL (GPIO22) to 3.3 V</w:t>
             </w:r>
           </w:p>
         </w:tc>

</xml_diff>